<commit_message>
updates to documents, split spanish and english app versions, change placebo to weather info
</commit_message>
<xml_diff>
--- a/docs/Information_Sheet_Informational_Comparisons.docx
+++ b/docs/Information_Sheet_Informational_Comparisons.docx
@@ -821,132 +821,95 @@
         <w:rPr>
           <w:rFonts w:ascii="Arial" w:hAnsi="Arial" w:cs="Arial"/>
         </w:rPr>
-        <w:t xml:space="preserve">Please contact the </w:t>
-      </w:r>
-      <w:r>
-        <w:rPr>
-          <w:rFonts w:ascii="Arial" w:hAnsi="Arial" w:cs="Arial"/>
-        </w:rPr>
-        <w:t>University of Rochester Research Subjects Review Board</w:t>
-      </w:r>
-      <w:r>
-        <w:rPr>
-          <w:rFonts w:ascii="Arial" w:hAnsi="Arial" w:cs="Arial"/>
-        </w:rPr>
-        <w:t xml:space="preserve"> at</w:t>
-      </w:r>
-      <w:r>
-        <w:rPr>
-          <w:rFonts w:ascii="Arial" w:hAnsi="Arial" w:cs="Arial"/>
-        </w:rPr>
-        <w:t xml:space="preserve"> 265 Crittenden Blvd., CU 420</w:t>
-      </w:r>
-      <w:r>
-        <w:rPr>
-          <w:rFonts w:ascii="Arial" w:hAnsi="Arial" w:cs="Arial"/>
-        </w:rPr>
-        <w:t>628</w:t>
-      </w:r>
-      <w:r>
-        <w:rPr>
-          <w:rFonts w:ascii="Arial" w:hAnsi="Arial" w:cs="Arial"/>
-        </w:rPr>
-        <w:t xml:space="preserve">, Rochester, NY 14642, Telephone </w:t>
-      </w:r>
-      <w:r>
-        <w:rPr>
-          <w:rFonts w:ascii="Arial" w:hAnsi="Arial" w:cs="Arial"/>
-        </w:rPr>
-        <w:t xml:space="preserve">+1 </w:t>
-      </w:r>
-      <w:r>
-        <w:rPr>
-          <w:rFonts w:ascii="Arial" w:hAnsi="Arial" w:cs="Arial"/>
-        </w:rPr>
-        <w:t>(585) 27</w:t>
-      </w:r>
-      <w:r>
-        <w:rPr>
-          <w:rFonts w:ascii="Arial" w:hAnsi="Arial" w:cs="Arial"/>
-        </w:rPr>
-        <w:t>3-4127</w:t>
-      </w:r>
-      <w:r>
-        <w:rPr>
-          <w:rFonts w:ascii="Arial" w:hAnsi="Arial" w:cs="Arial"/>
-        </w:rPr>
-        <w:t xml:space="preserve"> </w:t>
-      </w:r>
-      <w:r>
-        <w:rPr>
-          <w:rFonts w:ascii="Arial" w:hAnsi="Arial" w:cs="Arial"/>
-        </w:rPr>
-        <w:t>or</w:t>
-      </w:r>
-      <w:r>
-        <w:rPr>
-          <w:rFonts w:ascii="Arial" w:hAnsi="Arial" w:cs="Arial"/>
-        </w:rPr>
-        <w:t xml:space="preserve"> </w:t>
-      </w:r>
-      <w:r>
-        <w:rPr>
-          <w:rFonts w:ascii="Arial" w:hAnsi="Arial" w:cs="Arial"/>
-        </w:rPr>
-        <w:t xml:space="preserve">+1 </w:t>
-      </w:r>
-      <w:r>
-        <w:rPr>
-          <w:rFonts w:ascii="Arial" w:hAnsi="Arial" w:cs="Arial"/>
-        </w:rPr>
-        <w:t xml:space="preserve">(877) 449-4441 </w:t>
-      </w:r>
-      <w:r>
-        <w:rPr>
-          <w:rFonts w:ascii="Arial" w:hAnsi="Arial" w:cs="Arial"/>
-        </w:rPr>
-        <w:t>for the following reasons:</w:t>
+        <w:t xml:space="preserve">Please contact the University of Rochester Research Subjects Review Board at 265 Crittenden Blvd., CU 420628, Rochester, NY 14642, Telephone </w:t>
+      </w:r>
+      <w:r>
+        <w:rPr>
+          <w:rFonts w:ascii="Arial" w:hAnsi="Arial" w:cs="Arial"/>
+        </w:rPr>
+        <w:t xml:space="preserve">+001 </w:t>
+      </w:r>
+      <w:r>
+        <w:rPr>
+          <w:rFonts w:ascii="Arial" w:hAnsi="Arial" w:cs="Arial"/>
+        </w:rPr>
+        <w:t>(585) 273-4127or</w:t>
+      </w:r>
+      <w:r>
+        <w:rPr>
+          <w:rFonts w:ascii="Arial" w:hAnsi="Arial" w:cs="Arial"/>
+        </w:rPr>
+        <w:t xml:space="preserve"> +001</w:t>
+      </w:r>
+      <w:r>
+        <w:rPr>
+          <w:rFonts w:ascii="Arial" w:hAnsi="Arial" w:cs="Arial"/>
+        </w:rPr>
+        <w:t xml:space="preserve"> (877) 449-4441. To reach the Office for Human Subject Protection, use the </w:t>
+      </w:r>
+      <w:hyperlink r:id="rId7" w:history="1">
+        <w:r>
+          <w:rPr>
+            <w:rStyle w:val="Hyperlink"/>
+            <w:rFonts w:ascii="Arial" w:hAnsi="Arial" w:cs="Arial"/>
+          </w:rPr>
+          <w:t>Feedback Form</w:t>
+        </w:r>
+      </w:hyperlink>
+      <w:r>
+        <w:rPr>
+          <w:rFonts w:ascii="Arial" w:hAnsi="Arial" w:cs="Arial"/>
+        </w:rPr>
+        <w:t xml:space="preserve"> for the following reasons:</w:t>
       </w:r>
     </w:p>
     <w:p>
       <w:pPr>
+        <w:pStyle w:val="ListParagraph"/>
         <w:numPr>
           <w:ilvl w:val="0"/>
-          <w:numId w:val="4"/>
+          <w:numId w:val="8"/>
         </w:numPr>
-        <w:tabs>
-          <w:tab w:val="clear" w:pos="2880"/>
-          <w:tab w:val="num" w:pos="1080"/>
-        </w:tabs>
-        <w:ind w:left="1080"/>
-        <w:rPr>
-          <w:rFonts w:ascii="Arial" w:hAnsi="Arial" w:cs="Arial"/>
-        </w:rPr>
-      </w:pPr>
-      <w:r>
-        <w:rPr>
-          <w:rFonts w:ascii="Arial" w:hAnsi="Arial" w:cs="Arial"/>
-        </w:rPr>
-        <w:t xml:space="preserve">You wish to talk to someone other than the research staff about your rights as a research </w:t>
-      </w:r>
-      <w:r>
-        <w:rPr>
-          <w:rFonts w:ascii="Arial" w:hAnsi="Arial" w:cs="Arial"/>
-        </w:rPr>
-        <w:t>subject.</w:t>
-      </w:r>
+        <w:rPr>
+          <w:rFonts w:ascii="Arial" w:hAnsi="Arial" w:cs="Arial"/>
+        </w:rPr>
+      </w:pPr>
+      <w:r>
+        <w:rPr>
+          <w:rFonts w:ascii="Arial" w:hAnsi="Arial" w:cs="Arial"/>
+        </w:rPr>
+        <w:t xml:space="preserve">You wish to talk to someone other than the research staff about your rights as </w:t>
+      </w:r>
+      <w:proofErr w:type="gramStart"/>
+      <w:r>
+        <w:rPr>
+          <w:rFonts w:ascii="Arial" w:hAnsi="Arial" w:cs="Arial"/>
+        </w:rPr>
+        <w:t>a research</w:t>
+      </w:r>
+      <w:proofErr w:type="gramEnd"/>
+      <w:r>
+        <w:rPr>
+          <w:rFonts w:ascii="Arial" w:hAnsi="Arial" w:cs="Arial"/>
+        </w:rPr>
+        <w:t xml:space="preserve"> </w:t>
+      </w:r>
+      <w:proofErr w:type="gramStart"/>
+      <w:r>
+        <w:rPr>
+          <w:rFonts w:ascii="Arial" w:hAnsi="Arial" w:cs="Arial"/>
+        </w:rPr>
+        <w:t>subject;</w:t>
+      </w:r>
+      <w:proofErr w:type="gramEnd"/>
     </w:p>
     <w:p>
       <w:pPr>
+        <w:pStyle w:val="ListParagraph"/>
         <w:numPr>
           <w:ilvl w:val="0"/>
-          <w:numId w:val="4"/>
+          <w:numId w:val="8"/>
         </w:numPr>
-        <w:tabs>
-          <w:tab w:val="clear" w:pos="2880"/>
-          <w:tab w:val="num" w:pos="1080"/>
-        </w:tabs>
-        <w:ind w:left="1080"/>
         <w:rPr>
           <w:rFonts w:ascii="Arial" w:hAnsi="Arial" w:cs="Arial"/>
         </w:rPr>
@@ -957,97 +920,50 @@
         </w:rPr>
         <w:t xml:space="preserve">To voice concerns about the </w:t>
       </w:r>
-      <w:r>
-        <w:rPr>
-          <w:rFonts w:ascii="Arial" w:hAnsi="Arial" w:cs="Arial"/>
-        </w:rPr>
-        <w:t>research.</w:t>
-      </w:r>
+      <w:proofErr w:type="gramStart"/>
+      <w:r>
+        <w:rPr>
+          <w:rFonts w:ascii="Arial" w:hAnsi="Arial" w:cs="Arial"/>
+        </w:rPr>
+        <w:t>research;</w:t>
+      </w:r>
+      <w:proofErr w:type="gramEnd"/>
     </w:p>
     <w:p>
       <w:pPr>
+        <w:pStyle w:val="ListParagraph"/>
         <w:numPr>
           <w:ilvl w:val="0"/>
-          <w:numId w:val="4"/>
+          <w:numId w:val="8"/>
         </w:numPr>
-        <w:tabs>
-          <w:tab w:val="clear" w:pos="2880"/>
-          <w:tab w:val="num" w:pos="1080"/>
-        </w:tabs>
-        <w:ind w:left="1080"/>
-        <w:rPr>
-          <w:rFonts w:ascii="Arial" w:hAnsi="Arial" w:cs="Arial"/>
-        </w:rPr>
-      </w:pPr>
-      <w:r>
-        <w:rPr>
-          <w:rFonts w:ascii="Arial" w:hAnsi="Arial" w:cs="Arial"/>
-        </w:rPr>
-        <w:t xml:space="preserve">To provide input concerning the research </w:t>
-      </w:r>
-      <w:r>
-        <w:rPr>
-          <w:rFonts w:ascii="Arial" w:hAnsi="Arial" w:cs="Arial"/>
-        </w:rPr>
-        <w:t>process.</w:t>
+        <w:rPr>
+          <w:rFonts w:ascii="Arial" w:hAnsi="Arial" w:cs="Arial"/>
+        </w:rPr>
+      </w:pPr>
+      <w:r>
+        <w:rPr>
+          <w:rFonts w:ascii="Arial" w:hAnsi="Arial" w:cs="Arial"/>
+        </w:rPr>
+        <w:t>To provide input concerning the research process and/or in the event the study staff could not be reached.</w:t>
       </w:r>
     </w:p>
     <w:p>
       <w:pPr>
-        <w:numPr>
-          <w:ilvl w:val="0"/>
-          <w:numId w:val="4"/>
-        </w:numPr>
-        <w:tabs>
-          <w:tab w:val="clear" w:pos="2880"/>
-          <w:tab w:val="num" w:pos="1080"/>
-        </w:tabs>
-        <w:ind w:left="1080"/>
-        <w:rPr>
-          <w:rFonts w:ascii="Arial" w:hAnsi="Arial" w:cs="Arial"/>
-        </w:rPr>
-      </w:pPr>
-      <w:r>
-        <w:rPr>
-          <w:rFonts w:ascii="Arial" w:hAnsi="Arial" w:cs="Arial"/>
-        </w:rPr>
-        <w:t xml:space="preserve">In </w:t>
-      </w:r>
-      <w:proofErr w:type="gramStart"/>
-      <w:r>
-        <w:rPr>
-          <w:rFonts w:ascii="Arial" w:hAnsi="Arial" w:cs="Arial"/>
-        </w:rPr>
-        <w:t>the</w:t>
-      </w:r>
-      <w:proofErr w:type="gramEnd"/>
-      <w:r>
-        <w:rPr>
-          <w:rFonts w:ascii="Arial" w:hAnsi="Arial" w:cs="Arial"/>
-        </w:rPr>
-        <w:t xml:space="preserve"> event the study staff could not be reached.</w:t>
-      </w:r>
-    </w:p>
-    <w:p>
-      <w:pPr>
-        <w:pStyle w:val="BodyText2"/>
         <w:rPr>
           <w:rFonts w:cs="Arial"/>
-          <w:szCs w:val="24"/>
         </w:rPr>
       </w:pPr>
       <w:r>
         <w:rPr>
           <w:rFonts w:cs="Arial"/>
-          <w:szCs w:val="24"/>
           <w:lang w:eastAsia="zh-CN"/>
         </w:rPr>
         <w:t xml:space="preserve"> </w:t>
       </w:r>
     </w:p>
     <w:sectPr>
-      <w:headerReference w:type="default" r:id="rId7"/>
-      <w:footerReference w:type="default" r:id="rId8"/>
+      <w:headerReference w:type="default" r:id="rId8"/>
+      <w:footerReference w:type="default" r:id="rId9"/>
       <w:pgSz w:w="12240" w:h="15840" w:code="1"/>
       <w:pgMar w:top="1440" w:right="1440" w:bottom="2880" w:left="1440" w:header="720" w:footer="1152" w:gutter="0"/>
       <w:cols w:space="720"/>
@@ -2040,6 +1956,119 @@
     </w:lvl>
   </w:abstractNum>
   <w:abstractNum w:abstractNumId="5" w15:restartNumberingAfterBreak="0">
+    <w:nsid w:val="6F696590"/>
+    <w:multiLevelType w:val="hybridMultilevel"/>
+    <w:tmpl w:val="5BF2B2EC"/>
+    <w:lvl w:ilvl="0" w:tplc="04090001">
+      <w:start w:val="1"/>
+      <w:numFmt w:val="bullet"/>
+      <w:lvlText w:val=""/>
+      <w:lvlJc w:val="left"/>
+      <w:pPr>
+        <w:ind w:left="720" w:hanging="360"/>
+      </w:pPr>
+      <w:rPr>
+        <w:rFonts w:ascii="Symbol" w:hAnsi="Symbol" w:hint="default"/>
+      </w:rPr>
+    </w:lvl>
+    <w:lvl w:ilvl="1" w:tplc="04090003" w:tentative="1">
+      <w:start w:val="1"/>
+      <w:numFmt w:val="bullet"/>
+      <w:lvlText w:val="o"/>
+      <w:lvlJc w:val="left"/>
+      <w:pPr>
+        <w:ind w:left="1440" w:hanging="360"/>
+      </w:pPr>
+      <w:rPr>
+        <w:rFonts w:ascii="Courier New" w:hAnsi="Courier New" w:cs="Courier New" w:hint="default"/>
+      </w:rPr>
+    </w:lvl>
+    <w:lvl w:ilvl="2" w:tplc="04090005" w:tentative="1">
+      <w:start w:val="1"/>
+      <w:numFmt w:val="bullet"/>
+      <w:lvlText w:val=""/>
+      <w:lvlJc w:val="left"/>
+      <w:pPr>
+        <w:ind w:left="2160" w:hanging="360"/>
+      </w:pPr>
+      <w:rPr>
+        <w:rFonts w:ascii="Wingdings" w:hAnsi="Wingdings" w:hint="default"/>
+      </w:rPr>
+    </w:lvl>
+    <w:lvl w:ilvl="3" w:tplc="04090001" w:tentative="1">
+      <w:start w:val="1"/>
+      <w:numFmt w:val="bullet"/>
+      <w:lvlText w:val=""/>
+      <w:lvlJc w:val="left"/>
+      <w:pPr>
+        <w:ind w:left="2880" w:hanging="360"/>
+      </w:pPr>
+      <w:rPr>
+        <w:rFonts w:ascii="Symbol" w:hAnsi="Symbol" w:hint="default"/>
+      </w:rPr>
+    </w:lvl>
+    <w:lvl w:ilvl="4" w:tplc="04090003" w:tentative="1">
+      <w:start w:val="1"/>
+      <w:numFmt w:val="bullet"/>
+      <w:lvlText w:val="o"/>
+      <w:lvlJc w:val="left"/>
+      <w:pPr>
+        <w:ind w:left="3600" w:hanging="360"/>
+      </w:pPr>
+      <w:rPr>
+        <w:rFonts w:ascii="Courier New" w:hAnsi="Courier New" w:cs="Courier New" w:hint="default"/>
+      </w:rPr>
+    </w:lvl>
+    <w:lvl w:ilvl="5" w:tplc="04090005" w:tentative="1">
+      <w:start w:val="1"/>
+      <w:numFmt w:val="bullet"/>
+      <w:lvlText w:val=""/>
+      <w:lvlJc w:val="left"/>
+      <w:pPr>
+        <w:ind w:left="4320" w:hanging="360"/>
+      </w:pPr>
+      <w:rPr>
+        <w:rFonts w:ascii="Wingdings" w:hAnsi="Wingdings" w:hint="default"/>
+      </w:rPr>
+    </w:lvl>
+    <w:lvl w:ilvl="6" w:tplc="04090001" w:tentative="1">
+      <w:start w:val="1"/>
+      <w:numFmt w:val="bullet"/>
+      <w:lvlText w:val=""/>
+      <w:lvlJc w:val="left"/>
+      <w:pPr>
+        <w:ind w:left="5040" w:hanging="360"/>
+      </w:pPr>
+      <w:rPr>
+        <w:rFonts w:ascii="Symbol" w:hAnsi="Symbol" w:hint="default"/>
+      </w:rPr>
+    </w:lvl>
+    <w:lvl w:ilvl="7" w:tplc="04090003" w:tentative="1">
+      <w:start w:val="1"/>
+      <w:numFmt w:val="bullet"/>
+      <w:lvlText w:val="o"/>
+      <w:lvlJc w:val="left"/>
+      <w:pPr>
+        <w:ind w:left="5760" w:hanging="360"/>
+      </w:pPr>
+      <w:rPr>
+        <w:rFonts w:ascii="Courier New" w:hAnsi="Courier New" w:cs="Courier New" w:hint="default"/>
+      </w:rPr>
+    </w:lvl>
+    <w:lvl w:ilvl="8" w:tplc="04090005" w:tentative="1">
+      <w:start w:val="1"/>
+      <w:numFmt w:val="bullet"/>
+      <w:lvlText w:val=""/>
+      <w:lvlJc w:val="left"/>
+      <w:pPr>
+        <w:ind w:left="6480" w:hanging="360"/>
+      </w:pPr>
+      <w:rPr>
+        <w:rFonts w:ascii="Wingdings" w:hAnsi="Wingdings" w:hint="default"/>
+      </w:rPr>
+    </w:lvl>
+  </w:abstractNum>
+  <w:abstractNum w:abstractNumId="6" w15:restartNumberingAfterBreak="0">
     <w:nsid w:val="70035FC7"/>
     <w:multiLevelType w:val="hybridMultilevel"/>
     <w:tmpl w:val="572224D8"/>
@@ -2179,7 +2208,7 @@
       </w:rPr>
     </w:lvl>
   </w:abstractNum>
-  <w:abstractNum w:abstractNumId="6" w15:restartNumberingAfterBreak="0">
+  <w:abstractNum w:abstractNumId="7" w15:restartNumberingAfterBreak="0">
     <w:nsid w:val="799E795F"/>
     <w:multiLevelType w:val="hybridMultilevel"/>
     <w:tmpl w:val="F716AD12"/>
@@ -2299,19 +2328,22 @@
     <w:abstractNumId w:val="2"/>
   </w:num>
   <w:num w:numId="3" w16cid:durableId="996567523">
-    <w:abstractNumId w:val="5"/>
+    <w:abstractNumId w:val="6"/>
   </w:num>
   <w:num w:numId="4" w16cid:durableId="1819958071">
     <w:abstractNumId w:val="3"/>
   </w:num>
   <w:num w:numId="5" w16cid:durableId="475220697">
-    <w:abstractNumId w:val="6"/>
+    <w:abstractNumId w:val="7"/>
   </w:num>
   <w:num w:numId="6" w16cid:durableId="565532045">
     <w:abstractNumId w:val="0"/>
   </w:num>
   <w:num w:numId="7" w16cid:durableId="1353844354">
     <w:abstractNumId w:val="1"/>
+  </w:num>
+  <w:num w:numId="8" w16cid:durableId="26638623">
+    <w:abstractNumId w:val="5"/>
   </w:num>
 </w:numbering>
 </file>
@@ -2821,6 +2853,17 @@
       <w:szCs w:val="24"/>
     </w:rPr>
   </w:style>
+  <w:style w:type="paragraph" w:styleId="ListParagraph">
+    <w:name w:val="List Paragraph"/>
+    <w:basedOn w:val="Normal"/>
+    <w:uiPriority w:val="34"/>
+    <w:qFormat/>
+    <w:rsid w:val="00831A26"/>
+    <w:pPr>
+      <w:ind w:left="720"/>
+      <w:contextualSpacing/>
+    </w:pPr>
+  </w:style>
 </w:styles>
 </file>
 

</xml_diff>